<commit_message>
docs: update Terms of Service, Privacy Policy, and product spec
Co-Authored-By: Claude Opus 4.8 <noreply@anthropic.com>
</commit_message>
<xml_diff>
--- a/product_spec.docx
+++ b/product_spec.docx
@@ -705,7 +705,7 @@
           <w:sz w:val="20"/>
           <w:szCs w:val="20"/>
         </w:rPr>
-        <w:t>delete account button (visually distinct — red, outlined); triggers a confirmation modal explaining that personal data will be deleted but posts in shared moments remain attributed to the user; user must type their username to confirm before deletion proceeds</w:t>
+        <w:t>delete account button (visually distinct — red, outlined). If the user owns any moment shared with at least one other accepted member, deletion is blocked: a “Transfer ownership first” modal lists the blocking moments (scrollable, linking to each), and the user must transfer ownership or delete each moment before proceeding — no username field or delete action is shown in this state. Once the user owns no shared moments, the standard confirmation modal appears: it states that deletion is permanent and removes the account plus every post the user has ever authored, anywhere on the platform (not just in moments they own); the user must type their username to confirm before deletion proceeds.</w:t>
       </w:r>
     </w:p>
     <w:p>
@@ -800,7 +800,7 @@
         <w:spacing w:before="40" w:after="40"/>
       </w:pPr>
       <w:r>
-        <w:t>Deleting an account removes all personal data; posts left in shared moments remain, attributed to the user</w:t>
+        <w:t>Deleting an account removes all personal data and every post the user has ever authored, anywhere on the platform. A user cannot delete their account while they own a moment shared with at least one other accepted member — they must transfer ownership of that moment (or delete it) first, mirroring the Leave Moment ownership-transfer requirement in Section 2.5. Moments the user owns with no other members are deleted automatically along with the account. This guard is enforced server-side (re-checked at deletion time, not just in the UI) so a stale client state cannot bypass it.</w:t>
       </w:r>
     </w:p>
     <w:p>
@@ -11914,7 +11914,7 @@
       </w:pPr>
       <w:r>
         <w:lastRenderedPageBreak/>
-        <w:t>“The Account page (/account) must have three clearly separated sections. (1) Profile: editable fields for first name, last name, username (real-time uniqueness check as the user types), and email address. Email changes require the user to re-authenticate before saving — this is a Supabase Auth requirement. Profile photo: show the current photo with options to upload a new one, replace the existing one, or remove it entirely; store in Supabase Storage. (2) Security: a change password form with three fields — current password, new password, confirm new password. Validate that new and confirm match before submitting. (3) Danger zone: visually distinct section with a red outlined delete account button. Clicking it opens a confirmation modal that clearly states personal data will be permanently deleted but posts in shared moments will remain attributed to the user. The user must type their exact username into a text field in the modal before the delete button becomes active. On confirmation, hard delete all personal data from the users table and sign the user out.”</w:t>
+        <w:t>“The Account page (/account) must have three clearly separated sections. (1) Profile: editable fields for first name, last name, username (real-time uniqueness check as the user types), and email address. Email changes require the user to re-authenticate before saving — this is a Supabase Auth requirement. Profile photo: show the current photo with options to upload a new one, replace the existing one, or remove it entirely; store in Supabase Storage. (2) Security: a change password form with three fields — current password, new password, confirm new password. Validate that new and confirm match before submitting. (3) Danger zone: visually distinct section with a red outlined delete account button. Before showing the confirmation modal, check whether the user owns any moment with at least one other accepted member; if so, block deletion and show a modal listing those moments, requiring the user to transfer ownership or delete each one first. Once the user owns no shared moments, show a confirmation modal stating that deletion is permanent and will remove the account and every post the user has ever authored, anywhere on the platform — not just in moments they own. The user must type their exact username into a text field in the modal before the delete button becomes active. On confirmation, re-check the ownership guard server-side, then hard delete all personal data from the users table and sign the user out.”</w:t>
       </w:r>
     </w:p>
     <w:p>

</xml_diff>